<commit_message>
Enhance project dialog and update curriculum vitae; add GitHub Actions workflow.
</commit_message>
<xml_diff>
--- a/public/curriculo/curriculo.docx
+++ b/public/curriculo/curriculo.docx
@@ -60,7 +60,7 @@
         </w:rPr>
         <w:t xml:space="preserve">Email: </w:t>
       </w:r>
-      <w:hyperlink r:id="rId6" w:history="1">
+      <w:hyperlink r:id="rId7" w:history="1">
         <w:r>
           <w:rPr>
             <w:rStyle w:val="Hyperlink"/>
@@ -147,7 +147,21 @@
           <w:sz w:val="24"/>
           <w:szCs w:val="24"/>
         </w:rPr>
-        <w:t xml:space="preserve"> - </w:t>
+        <w:t xml:space="preserve"> </w:t>
+      </w:r>
+      <w:r>
+        <w:rPr>
+          <w:sz w:val="24"/>
+          <w:szCs w:val="24"/>
+        </w:rPr>
+        <w:t>–</w:t>
+      </w:r>
+      <w:r>
+        <w:rPr>
+          <w:sz w:val="24"/>
+          <w:szCs w:val="24"/>
+        </w:rPr>
+        <w:t xml:space="preserve"> </w:t>
       </w:r>
       <w:r>
         <w:rPr>
@@ -165,13 +179,97 @@
         </w:rPr>
       </w:pPr>
       <w:r>
-        <w:rPr>
-          <w:sz w:val="24"/>
-          <w:szCs w:val="24"/>
-        </w:rPr>
-        <w:t xml:space="preserve">Linkedin: </w:t>
-      </w:r>
-      <w:hyperlink r:id="rId7" w:history="1">
+        <w:t>Portfólio</w:t>
+      </w:r>
+      <w:r>
+        <w:rPr>
+          <w:sz w:val="24"/>
+          <w:szCs w:val="24"/>
+        </w:rPr>
+        <w:t>:</w:t>
+      </w:r>
+      <w:r>
+        <w:rPr>
+          <w:sz w:val="24"/>
+          <w:szCs w:val="24"/>
+        </w:rPr>
+        <w:t xml:space="preserve"> </w:t>
+      </w:r>
+      <w:r>
+        <w:rPr>
+          <w:sz w:val="16"/>
+          <w:szCs w:val="16"/>
+        </w:rPr>
+        <w:t>(CTRL + CLIQUE)</w:t>
+      </w:r>
+      <w:r>
+        <w:rPr>
+          <w:sz w:val="20"/>
+          <w:szCs w:val="20"/>
+        </w:rPr>
+        <w:t xml:space="preserve"> </w:t>
+      </w:r>
+      <w:hyperlink r:id="rId8" w:history="1">
+        <w:r>
+          <w:rPr>
+            <w:rStyle w:val="Hyperlink"/>
+            <w:sz w:val="24"/>
+            <w:szCs w:val="24"/>
+          </w:rPr>
+          <w:t>https://portfolio-murex-six-57.vercel.app/</w:t>
+        </w:r>
+      </w:hyperlink>
+    </w:p>
+    <w:p>
+      <w:pPr>
+        <w:rPr>
+          <w:sz w:val="24"/>
+          <w:szCs w:val="24"/>
+        </w:rPr>
+      </w:pPr>
+      <w:r>
+        <w:rPr>
+          <w:sz w:val="24"/>
+          <w:szCs w:val="24"/>
+        </w:rPr>
+        <w:t>Linked</w:t>
+      </w:r>
+      <w:r>
+        <w:rPr>
+          <w:sz w:val="24"/>
+          <w:szCs w:val="24"/>
+        </w:rPr>
+        <w:t>I</w:t>
+      </w:r>
+      <w:r>
+        <w:rPr>
+          <w:sz w:val="24"/>
+          <w:szCs w:val="24"/>
+        </w:rPr>
+        <w:t>n:</w:t>
+      </w:r>
+      <w:r>
+        <w:rPr>
+          <w:sz w:val="24"/>
+          <w:szCs w:val="24"/>
+        </w:rPr>
+        <w:t xml:space="preserve"> </w:t>
+      </w:r>
+      <w:r>
+        <w:rPr>
+          <w:sz w:val="16"/>
+          <w:szCs w:val="16"/>
+        </w:rPr>
+        <w:t>(CTRL + CLIQUE)</w:t>
+      </w:r>
+      <w:r>
+        <w:rPr>
+          <w:sz w:val="20"/>
+          <w:szCs w:val="20"/>
+        </w:rPr>
+        <w:t xml:space="preserve"> </w:t>
+      </w:r>
+      <w:hyperlink r:id="rId9" w:history="1">
         <w:r>
           <w:rPr>
             <w:rStyle w:val="Hyperlink"/>
@@ -183,12 +281,6 @@
       </w:hyperlink>
     </w:p>
     <w:p>
-      <w:pPr>
-        <w:rPr>
-          <w:sz w:val="24"/>
-          <w:szCs w:val="24"/>
-        </w:rPr>
-      </w:pPr>
       <w:r>
         <w:rPr>
           <w:sz w:val="24"/>
@@ -196,7 +288,21 @@
         </w:rPr>
         <w:t xml:space="preserve">Github: </w:t>
       </w:r>
-      <w:hyperlink r:id="rId8" w:history="1">
+      <w:r>
+        <w:rPr>
+          <w:sz w:val="16"/>
+          <w:szCs w:val="16"/>
+        </w:rPr>
+        <w:t>(CTRL + CLIQUE)</w:t>
+      </w:r>
+      <w:r>
+        <w:rPr>
+          <w:sz w:val="24"/>
+          <w:szCs w:val="24"/>
+        </w:rPr>
+        <w:t xml:space="preserve"> </w:t>
+      </w:r>
+      <w:hyperlink r:id="rId10" w:history="1">
         <w:r>
           <w:rPr>
             <w:rStyle w:val="Hyperlink"/>
@@ -241,98 +347,96 @@
         <w:rPr>
           <w:sz w:val="24"/>
           <w:szCs w:val="24"/>
-        </w:rPr>
-      </w:pPr>
-      <w:r>
-        <w:rPr>
-          <w:sz w:val="24"/>
-          <w:szCs w:val="24"/>
-        </w:rPr>
-        <w:t xml:space="preserve">Com foco em Frontend e uma jornada de </w:t>
-      </w:r>
-      <w:r>
-        <w:rPr>
-          <w:sz w:val="24"/>
-          <w:szCs w:val="24"/>
-        </w:rPr>
-        <w:t>2</w:t>
-      </w:r>
-      <w:r>
-        <w:rPr>
-          <w:sz w:val="24"/>
-          <w:szCs w:val="24"/>
-        </w:rPr>
-        <w:t xml:space="preserve"> ano</w:t>
-      </w:r>
-      <w:r>
-        <w:rPr>
-          <w:sz w:val="24"/>
-          <w:szCs w:val="24"/>
-        </w:rPr>
-        <w:t>s</w:t>
-      </w:r>
-      <w:r>
-        <w:rPr>
-          <w:sz w:val="24"/>
-          <w:szCs w:val="24"/>
-        </w:rPr>
-        <w:t xml:space="preserve"> aprimorando habilidades em HTML, CSS</w:t>
-      </w:r>
-      <w:r>
-        <w:rPr>
-          <w:sz w:val="24"/>
-          <w:szCs w:val="24"/>
-        </w:rPr>
-        <w:t>,</w:t>
-      </w:r>
-      <w:r>
-        <w:rPr>
-          <w:sz w:val="24"/>
-          <w:szCs w:val="24"/>
-        </w:rPr>
-        <w:t xml:space="preserve"> JavaScript</w:t>
-      </w:r>
-      <w:r>
-        <w:rPr>
-          <w:sz w:val="24"/>
-          <w:szCs w:val="24"/>
-        </w:rPr>
-        <w:t xml:space="preserve"> e TypeScript</w:t>
-      </w:r>
-      <w:r>
-        <w:rPr>
-          <w:sz w:val="24"/>
-          <w:szCs w:val="24"/>
-        </w:rPr>
-        <w:t xml:space="preserve">, além de frameworks modernos como React, busco </w:t>
-      </w:r>
-      <w:r>
-        <w:rPr>
-          <w:sz w:val="24"/>
-          <w:szCs w:val="24"/>
-        </w:rPr>
-        <w:t>colocação no mercado de trabalho em</w:t>
-      </w:r>
-      <w:r>
-        <w:rPr>
-          <w:sz w:val="24"/>
-          <w:szCs w:val="24"/>
-        </w:rPr>
-        <w:t xml:space="preserve"> uma equipe de desenvolvimento onde </w:t>
-      </w:r>
-      <w:r>
-        <w:rPr>
-          <w:sz w:val="24"/>
-          <w:szCs w:val="24"/>
-        </w:rPr>
-        <w:t xml:space="preserve">eu </w:t>
-      </w:r>
-      <w:r>
-        <w:rPr>
-          <w:sz w:val="24"/>
-          <w:szCs w:val="24"/>
-        </w:rPr>
-        <w:t>possa aplicar minhas competências técnicas. Meu objetivo é criar interfaces intuitivas e experiências de usuário envolventes, alavancando boas práticas de design para desenvolver soluções eficientes e acessíveis.</w:t>
+          <w:lang w:val="pt-BR"/>
+        </w:rPr>
+      </w:pPr>
+      <w:r>
+        <w:rPr>
+          <w:sz w:val="24"/>
+          <w:szCs w:val="24"/>
+          <w:lang w:val="pt-BR"/>
+        </w:rPr>
+        <w:t>Desenvolvedor Front-end com foco na construção de interfaces escaláveis, performáticas e orientadas à experiência do usuário. Possuo experiência no desenvolvimento de aplicações web modernas utilizando JavaScript/TypeScript, React e Next.js, integração com APIs REST, aplicando boas práticas de arquitetura, componentização</w:t>
+      </w:r>
+      <w:r>
+        <w:rPr>
+          <w:sz w:val="24"/>
+          <w:szCs w:val="24"/>
+          <w:lang w:val="pt-BR"/>
+        </w:rPr>
+        <w:t xml:space="preserve"> e</w:t>
+      </w:r>
+      <w:r>
+        <w:rPr>
+          <w:sz w:val="24"/>
+          <w:szCs w:val="24"/>
+          <w:lang w:val="pt-BR"/>
+        </w:rPr>
+        <w:t xml:space="preserve"> Clean Cod</w:t>
+      </w:r>
+      <w:r>
+        <w:rPr>
+          <w:sz w:val="24"/>
+          <w:szCs w:val="24"/>
+          <w:lang w:val="pt-BR"/>
+        </w:rPr>
+        <w:t>e</w:t>
+      </w:r>
+      <w:r>
+        <w:rPr>
+          <w:sz w:val="24"/>
+          <w:szCs w:val="24"/>
+          <w:lang w:val="pt-BR"/>
+        </w:rPr>
+        <w:t>. Tenho familiaridade com Node.js, testes automatizados (unitários e de integração), controle de versão com Git e práticas de CI/CD</w:t>
+      </w:r>
+      <w:r>
+        <w:rPr>
+          <w:sz w:val="24"/>
+          <w:szCs w:val="24"/>
+          <w:lang w:val="pt-BR"/>
+        </w:rPr>
+        <w:t xml:space="preserve"> (Github Actions)</w:t>
+      </w:r>
+      <w:r>
+        <w:rPr>
+          <w:sz w:val="24"/>
+          <w:szCs w:val="24"/>
+          <w:lang w:val="pt-BR"/>
+        </w:rPr>
+        <w:t xml:space="preserve">, além de noções de bancos de dados SQL e NoSQL. </w:t>
+      </w:r>
+      <w:r>
+        <w:rPr>
+          <w:sz w:val="24"/>
+          <w:szCs w:val="24"/>
+          <w:lang w:val="pt-BR"/>
+        </w:rPr>
+        <w:t>Com conhecimento em</w:t>
+      </w:r>
+      <w:r>
+        <w:rPr>
+          <w:sz w:val="24"/>
+          <w:szCs w:val="24"/>
+          <w:lang w:val="pt-BR"/>
+        </w:rPr>
+        <w:t xml:space="preserve"> Scrum/Kanban, code reviews e</w:t>
+      </w:r>
+      <w:r>
+        <w:rPr>
+          <w:sz w:val="24"/>
+          <w:szCs w:val="24"/>
+          <w:lang w:val="pt-BR"/>
+        </w:rPr>
+        <w:t xml:space="preserve"> apoiando</w:t>
+      </w:r>
+      <w:r>
+        <w:rPr>
+          <w:sz w:val="24"/>
+          <w:szCs w:val="24"/>
+          <w:lang w:val="pt-BR"/>
+        </w:rPr>
+        <w:t xml:space="preserve"> colaboração com times multidisciplinares para evolução contínua de sistemas, qualidade de código e entregas incrementais. Busco contribuir com excelência técnica, aprendizado contínuo e colaboração em ambientes que promovam inovação e crescimento mútuo.</w:t>
       </w:r>
     </w:p>
     <w:p>
@@ -347,412 +451,972 @@
     <w:p>
       <w:pPr>
         <w:spacing w:line="360" w:lineRule="auto"/>
-        <w:rPr>
-          <w:sz w:val="24"/>
-          <w:szCs w:val="24"/>
-        </w:rPr>
-      </w:pPr>
-      <w:r>
         <w:rPr>
           <w:b/>
           <w:sz w:val="28"/>
           <w:szCs w:val="28"/>
         </w:rPr>
-        <w:t>Projetos Pessoais</w:t>
-      </w:r>
-    </w:p>
-    <w:p>
-      <w:pPr>
-        <w:ind w:right="113"/>
-        <w:jc w:val="both"/>
-        <w:rPr>
-          <w:sz w:val="24"/>
-          <w:szCs w:val="24"/>
-        </w:rPr>
-      </w:pPr>
-      <w:r>
-        <w:rPr>
-          <w:b/>
-          <w:sz w:val="24"/>
-          <w:szCs w:val="24"/>
-        </w:rPr>
-        <w:t>Barber PRO</w:t>
-      </w:r>
-      <w:r>
-        <w:rPr>
-          <w:sz w:val="24"/>
-          <w:szCs w:val="24"/>
-        </w:rPr>
-        <w:t xml:space="preserve"> - Sistema web completo para barbearias, desde cadastro da barbearia, login, sistema de agendamento de cliente, cadastro de barbeiros, agenda de cortes, sistema de assinatura para barbearias com plano gratuito e plano pago que libera funcionalidades.</w:t>
-      </w:r>
-    </w:p>
-    <w:p>
-      <w:pPr>
-        <w:ind w:right="113"/>
-        <w:jc w:val="both"/>
-        <w:rPr>
-          <w:sz w:val="24"/>
-          <w:szCs w:val="24"/>
-        </w:rPr>
-      </w:pPr>
-      <w:r>
-        <w:rPr>
-          <w:sz w:val="24"/>
-          <w:szCs w:val="24"/>
-        </w:rPr>
-        <w:t>Tecnologias usadas: Node JS, Prisma, JWT, TypeScript, Express, Next JS, Vercel.</w:t>
-      </w:r>
-    </w:p>
-    <w:p>
-      <w:pPr>
-        <w:ind w:right="113"/>
-        <w:jc w:val="both"/>
-        <w:rPr>
-          <w:sz w:val="24"/>
-          <w:szCs w:val="24"/>
-        </w:rPr>
-      </w:pPr>
-      <w:r>
-        <w:rPr>
-          <w:sz w:val="24"/>
-          <w:szCs w:val="24"/>
-        </w:rPr>
-        <w:t>[Se tiver projeto no ar pode colocar o link ou link do repositório caso esteja público]</w:t>
-      </w:r>
-    </w:p>
-    <w:p>
-      <w:pPr>
-        <w:ind w:right="113"/>
-        <w:rPr>
-          <w:sz w:val="24"/>
-          <w:szCs w:val="24"/>
-        </w:rPr>
-      </w:pPr>
-    </w:p>
-    <w:p>
-      <w:pPr>
-        <w:spacing w:line="360" w:lineRule="auto"/>
+      </w:pPr>
+      <w:r>
         <w:rPr>
           <w:b/>
           <w:sz w:val="28"/>
           <w:szCs w:val="28"/>
         </w:rPr>
-      </w:pPr>
-      <w:r>
+        <w:t>Projetos Pessoais</w:t>
+      </w:r>
+    </w:p>
+    <w:p>
+      <w:pPr>
+        <w:spacing w:line="360" w:lineRule="auto"/>
+        <w:rPr>
+          <w:b/>
+        </w:rPr>
+      </w:pPr>
+      <w:r>
+        <w:rPr>
+          <w:b/>
+        </w:rPr>
+        <w:t>Para visualizar mais projetos, acesse o</w:t>
+      </w:r>
+      <w:r>
+        <w:rPr>
+          <w:b/>
+        </w:rPr>
+        <w:t xml:space="preserve"> meu</w:t>
+      </w:r>
+      <w:r>
+        <w:rPr>
+          <w:b/>
+        </w:rPr>
+        <w:t xml:space="preserve"> portfólio:</w:t>
+      </w:r>
+      <w:r>
+        <w:rPr>
+          <w:b/>
+        </w:rPr>
+        <w:t xml:space="preserve"> </w:t>
+      </w:r>
+      <w:r>
+        <w:rPr>
+          <w:sz w:val="16"/>
+          <w:szCs w:val="16"/>
+        </w:rPr>
+        <w:t>(CTRL + CLIQUE)</w:t>
+      </w:r>
+      <w:r>
+        <w:rPr>
+          <w:b/>
+        </w:rPr>
+        <w:t xml:space="preserve"> </w:t>
+      </w:r>
+      <w:hyperlink r:id="rId11" w:history="1">
+        <w:r>
+          <w:rPr>
+            <w:rStyle w:val="Hyperlink"/>
+          </w:rPr>
+          <w:t>https://portfolio-murex-six-57.vercel.app/</w:t>
+        </w:r>
+      </w:hyperlink>
+    </w:p>
+    <w:p>
+      <w:pPr>
+        <w:ind w:right="113"/>
+        <w:jc w:val="both"/>
+        <w:rPr>
+          <w:sz w:val="24"/>
+          <w:szCs w:val="24"/>
+          <w:lang w:val="pt-BR"/>
+        </w:rPr>
+      </w:pPr>
+      <w:r>
+        <w:rPr>
+          <w:b/>
+          <w:sz w:val="24"/>
+          <w:szCs w:val="24"/>
+        </w:rPr>
+        <w:t>Bioreino</w:t>
+      </w:r>
+      <w:r>
+        <w:rPr>
+          <w:sz w:val="24"/>
+          <w:szCs w:val="24"/>
+        </w:rPr>
+        <w:t xml:space="preserve"> - </w:t>
+      </w:r>
+      <w:r>
+        <w:rPr>
+          <w:sz w:val="24"/>
+          <w:szCs w:val="24"/>
+          <w:lang w:val="pt-BR"/>
+        </w:rPr>
+        <w:t>Plataforma de cursos voltados à biologia. Possui apresentação do que é a Bioreino; Login; Esqueceu a Senha; Sistema de envio de e-mail; Domínio próprio (bioreino.com) e (bioreino.com.br); Cadastro com Planos de assinatura (scholar e professional) com sistema de pagamento integrado e que libera acesso a determinados cursos; Dashboard para selecionar o curso que deseja assistir, além de ter um lembrete da última aula assistida.</w:t>
+      </w:r>
+    </w:p>
+    <w:p>
+      <w:pPr>
+        <w:ind w:right="113"/>
+        <w:jc w:val="both"/>
+        <w:rPr>
+          <w:sz w:val="24"/>
+          <w:szCs w:val="24"/>
+          <w:lang w:val="pt-BR"/>
+        </w:rPr>
+      </w:pPr>
+      <w:r>
+        <w:rPr>
+          <w:sz w:val="24"/>
+          <w:szCs w:val="24"/>
+          <w:lang w:val="pt-BR"/>
+        </w:rPr>
+        <w:t xml:space="preserve">Tecnologias usadas: </w:t>
+      </w:r>
+      <w:r>
+        <w:rPr>
+          <w:sz w:val="24"/>
+          <w:szCs w:val="24"/>
+          <w:lang w:val="pt-BR"/>
+        </w:rPr>
+        <w:t>React</w:t>
+      </w:r>
+      <w:r>
+        <w:rPr>
+          <w:sz w:val="24"/>
+          <w:szCs w:val="24"/>
+          <w:lang w:val="pt-BR"/>
+        </w:rPr>
+        <w:t xml:space="preserve">, </w:t>
+      </w:r>
+      <w:r>
+        <w:rPr>
+          <w:sz w:val="24"/>
+          <w:szCs w:val="24"/>
+          <w:lang w:val="pt-BR"/>
+        </w:rPr>
+        <w:t>Next JS</w:t>
+      </w:r>
+      <w:r>
+        <w:rPr>
+          <w:sz w:val="24"/>
+          <w:szCs w:val="24"/>
+          <w:lang w:val="pt-BR"/>
+        </w:rPr>
+        <w:t xml:space="preserve">, </w:t>
+      </w:r>
+      <w:r>
+        <w:rPr>
+          <w:sz w:val="24"/>
+          <w:szCs w:val="24"/>
+          <w:lang w:val="pt-BR"/>
+        </w:rPr>
+        <w:t>TypeScript</w:t>
+      </w:r>
+      <w:r>
+        <w:rPr>
+          <w:sz w:val="24"/>
+          <w:szCs w:val="24"/>
+          <w:lang w:val="pt-BR"/>
+        </w:rPr>
+        <w:t xml:space="preserve">, </w:t>
+      </w:r>
+      <w:r>
+        <w:rPr>
+          <w:sz w:val="24"/>
+          <w:szCs w:val="24"/>
+          <w:lang w:val="pt-BR"/>
+        </w:rPr>
+        <w:t>Jest</w:t>
+      </w:r>
+      <w:r>
+        <w:rPr>
+          <w:sz w:val="24"/>
+          <w:szCs w:val="24"/>
+          <w:lang w:val="pt-BR"/>
+        </w:rPr>
+        <w:t xml:space="preserve">, </w:t>
+      </w:r>
+      <w:r>
+        <w:rPr>
+          <w:sz w:val="24"/>
+          <w:szCs w:val="24"/>
+          <w:lang w:val="pt-BR"/>
+        </w:rPr>
+        <w:t>React Testing Library</w:t>
+      </w:r>
+      <w:r>
+        <w:rPr>
+          <w:sz w:val="24"/>
+          <w:szCs w:val="24"/>
+          <w:lang w:val="pt-BR"/>
+        </w:rPr>
+        <w:t>,</w:t>
+      </w:r>
+      <w:r>
+        <w:rPr>
+          <w:sz w:val="24"/>
+          <w:szCs w:val="24"/>
+          <w:lang w:val="pt-BR"/>
+        </w:rPr>
+        <w:t xml:space="preserve"> React Hook Form,</w:t>
+      </w:r>
+      <w:r>
+        <w:rPr>
+          <w:sz w:val="24"/>
+          <w:szCs w:val="24"/>
+          <w:lang w:val="pt-BR"/>
+        </w:rPr>
+        <w:t xml:space="preserve"> </w:t>
+      </w:r>
+      <w:r>
+        <w:rPr>
+          <w:sz w:val="24"/>
+          <w:szCs w:val="24"/>
+          <w:lang w:val="pt-BR"/>
+        </w:rPr>
+        <w:t>Base UI</w:t>
+      </w:r>
+      <w:r>
+        <w:rPr>
+          <w:sz w:val="24"/>
+          <w:szCs w:val="24"/>
+          <w:lang w:val="pt-BR"/>
+        </w:rPr>
+        <w:t xml:space="preserve">, </w:t>
+      </w:r>
+      <w:r>
+        <w:rPr>
+          <w:sz w:val="24"/>
+          <w:szCs w:val="24"/>
+          <w:lang w:val="pt-BR"/>
+        </w:rPr>
+        <w:t>Stripe</w:t>
+      </w:r>
+      <w:r>
+        <w:rPr>
+          <w:sz w:val="24"/>
+          <w:szCs w:val="24"/>
+          <w:lang w:val="pt-BR"/>
+        </w:rPr>
+        <w:t xml:space="preserve">, </w:t>
+      </w:r>
+      <w:r>
+        <w:rPr>
+          <w:sz w:val="24"/>
+          <w:szCs w:val="24"/>
+          <w:lang w:val="pt-BR"/>
+        </w:rPr>
+        <w:t>CSS Modules</w:t>
+      </w:r>
+      <w:r>
+        <w:rPr>
+          <w:sz w:val="24"/>
+          <w:szCs w:val="24"/>
+          <w:lang w:val="pt-BR"/>
+        </w:rPr>
+        <w:t xml:space="preserve">, </w:t>
+      </w:r>
+      <w:r>
+        <w:rPr>
+          <w:sz w:val="24"/>
+          <w:szCs w:val="24"/>
+          <w:lang w:val="pt-BR"/>
+        </w:rPr>
+        <w:t>Zod</w:t>
+      </w:r>
+      <w:r>
+        <w:rPr>
+          <w:sz w:val="24"/>
+          <w:szCs w:val="24"/>
+          <w:lang w:val="pt-BR"/>
+        </w:rPr>
+        <w:t xml:space="preserve">, </w:t>
+      </w:r>
+      <w:r>
+        <w:rPr>
+          <w:sz w:val="24"/>
+          <w:szCs w:val="24"/>
+          <w:lang w:val="pt-BR"/>
+        </w:rPr>
+        <w:t>Node JS</w:t>
+      </w:r>
+      <w:r>
+        <w:rPr>
+          <w:sz w:val="24"/>
+          <w:szCs w:val="24"/>
+          <w:lang w:val="pt-BR"/>
+        </w:rPr>
+        <w:t xml:space="preserve">, </w:t>
+      </w:r>
+      <w:r>
+        <w:rPr>
+          <w:sz w:val="24"/>
+          <w:szCs w:val="24"/>
+          <w:lang w:val="pt-BR"/>
+        </w:rPr>
+        <w:t>MongoDB</w:t>
+      </w:r>
+      <w:r>
+        <w:rPr>
+          <w:sz w:val="24"/>
+          <w:szCs w:val="24"/>
+          <w:lang w:val="pt-BR"/>
+        </w:rPr>
+        <w:t xml:space="preserve">, </w:t>
+      </w:r>
+      <w:r>
+        <w:rPr>
+          <w:sz w:val="24"/>
+          <w:szCs w:val="24"/>
+          <w:lang w:val="pt-BR"/>
+        </w:rPr>
+        <w:t>JWT</w:t>
+      </w:r>
+      <w:r>
+        <w:rPr>
+          <w:sz w:val="24"/>
+          <w:szCs w:val="24"/>
+          <w:lang w:val="pt-BR"/>
+        </w:rPr>
+        <w:t xml:space="preserve">, </w:t>
+      </w:r>
+      <w:r>
+        <w:rPr>
+          <w:sz w:val="24"/>
+          <w:szCs w:val="24"/>
+          <w:lang w:val="pt-BR"/>
+        </w:rPr>
+        <w:t>Express</w:t>
+      </w:r>
+      <w:r>
+        <w:rPr>
+          <w:sz w:val="24"/>
+          <w:szCs w:val="24"/>
+          <w:lang w:val="pt-BR"/>
+        </w:rPr>
+        <w:t xml:space="preserve">, </w:t>
+      </w:r>
+      <w:r>
+        <w:rPr>
+          <w:sz w:val="24"/>
+          <w:szCs w:val="24"/>
+          <w:lang w:val="pt-BR"/>
+        </w:rPr>
+        <w:t>Resend</w:t>
+      </w:r>
+      <w:r>
+        <w:rPr>
+          <w:sz w:val="24"/>
+          <w:szCs w:val="24"/>
+          <w:lang w:val="pt-BR"/>
+        </w:rPr>
+        <w:t xml:space="preserve">, </w:t>
+      </w:r>
+      <w:r>
+        <w:rPr>
+          <w:sz w:val="24"/>
+          <w:szCs w:val="24"/>
+          <w:lang w:val="pt-BR"/>
+        </w:rPr>
+        <w:t>Vercel</w:t>
+      </w:r>
+    </w:p>
+    <w:p>
+      <w:pPr>
+        <w:ind w:right="113"/>
+        <w:jc w:val="both"/>
+        <w:rPr>
+          <w:sz w:val="24"/>
+          <w:szCs w:val="24"/>
+          <w:lang w:val="pt-BR"/>
+        </w:rPr>
+      </w:pPr>
+      <w:r>
+        <w:rPr>
+          <w:sz w:val="16"/>
+          <w:szCs w:val="16"/>
+        </w:rPr>
+        <w:t>(CTRL + CLIQUE)</w:t>
+      </w:r>
+      <w:r>
+        <w:rPr>
+          <w:sz w:val="16"/>
+          <w:szCs w:val="16"/>
+        </w:rPr>
+        <w:t xml:space="preserve"> </w:t>
+      </w:r>
+      <w:hyperlink r:id="rId12" w:history="1">
+        <w:r>
+          <w:rPr>
+            <w:rStyle w:val="Hyperlink"/>
+            <w:sz w:val="24"/>
+            <w:szCs w:val="24"/>
+            <w:lang w:val="pt-BR"/>
+          </w:rPr>
+          <w:t>https://www.bioreino.com.br/</w:t>
+        </w:r>
+      </w:hyperlink>
+    </w:p>
+    <w:p>
+      <w:pPr>
+        <w:ind w:right="113"/>
+        <w:jc w:val="both"/>
+        <w:rPr>
+          <w:sz w:val="24"/>
+          <w:szCs w:val="24"/>
+          <w:lang w:val="pt-BR"/>
+        </w:rPr>
+      </w:pPr>
+    </w:p>
+    <w:p>
+      <w:pPr>
+        <w:ind w:right="113"/>
+        <w:jc w:val="both"/>
+        <w:rPr>
+          <w:sz w:val="24"/>
+          <w:szCs w:val="24"/>
+        </w:rPr>
+      </w:pPr>
+      <w:r>
+        <w:rPr>
+          <w:b/>
+          <w:sz w:val="24"/>
+          <w:szCs w:val="24"/>
+        </w:rPr>
+        <w:t>Barber PRO</w:t>
+      </w:r>
+      <w:r>
+        <w:rPr>
+          <w:sz w:val="24"/>
+          <w:szCs w:val="24"/>
+        </w:rPr>
+        <w:t xml:space="preserve"> - Sistema web completo para barbearias, desde cadastro da barbearia, login, sistema de agendamento de cliente, cadastro de barbeiros, agenda de cortes, </w:t>
+      </w:r>
+      <w:r>
+        <w:rPr>
+          <w:sz w:val="24"/>
+          <w:szCs w:val="24"/>
+        </w:rPr>
+        <w:lastRenderedPageBreak/>
+        <w:t>sistema de assinatura para barbearias com plano gratuito e plano pago que libera funcionalidades.</w:t>
+      </w:r>
+    </w:p>
+    <w:p>
+      <w:pPr>
+        <w:ind w:right="113"/>
+        <w:jc w:val="both"/>
+        <w:rPr>
+          <w:sz w:val="24"/>
+          <w:szCs w:val="24"/>
+        </w:rPr>
+      </w:pPr>
+      <w:r>
+        <w:rPr>
+          <w:sz w:val="24"/>
+          <w:szCs w:val="24"/>
+        </w:rPr>
+        <w:t xml:space="preserve">Tecnologias usadas: </w:t>
+      </w:r>
+      <w:r>
+        <w:rPr>
+          <w:sz w:val="24"/>
+          <w:szCs w:val="24"/>
+        </w:rPr>
+        <w:t xml:space="preserve">React, Next JS, TypeScript, Stripe, Vercel, </w:t>
+      </w:r>
+      <w:r>
+        <w:rPr>
+          <w:sz w:val="24"/>
+          <w:szCs w:val="24"/>
+        </w:rPr>
+        <w:t>Node JS, Prisma, JWT</w:t>
+      </w:r>
+      <w:r>
+        <w:rPr>
+          <w:sz w:val="24"/>
+          <w:szCs w:val="24"/>
+        </w:rPr>
+        <w:t xml:space="preserve">, </w:t>
+      </w:r>
+      <w:r>
+        <w:rPr>
+          <w:sz w:val="24"/>
+          <w:szCs w:val="24"/>
+        </w:rPr>
+        <w:t>Express.</w:t>
+      </w:r>
+    </w:p>
+    <w:p>
+      <w:pPr>
+        <w:ind w:right="113"/>
+        <w:jc w:val="both"/>
+        <w:rPr>
+          <w:sz w:val="24"/>
+          <w:szCs w:val="24"/>
+        </w:rPr>
+      </w:pPr>
+      <w:r>
+        <w:rPr>
+          <w:sz w:val="16"/>
+          <w:szCs w:val="16"/>
+        </w:rPr>
+        <w:t>(CTRL + CLIQUE)</w:t>
+      </w:r>
+      <w:r>
+        <w:rPr>
+          <w:sz w:val="16"/>
+          <w:szCs w:val="16"/>
+        </w:rPr>
+        <w:t xml:space="preserve"> </w:t>
+      </w:r>
+      <w:hyperlink r:id="rId13" w:history="1">
+        <w:r>
+          <w:rPr>
+            <w:rStyle w:val="Hyperlink"/>
+            <w:sz w:val="24"/>
+            <w:szCs w:val="24"/>
+          </w:rPr>
+          <w:t>https://sistema-barbearia-web-roan.vercel.app/login</w:t>
+        </w:r>
+      </w:hyperlink>
+    </w:p>
+    <w:p>
+      <w:pPr>
+        <w:ind w:right="113"/>
+        <w:rPr>
+          <w:sz w:val="24"/>
+          <w:szCs w:val="24"/>
+        </w:rPr>
+      </w:pPr>
+    </w:p>
+    <w:p>
+      <w:pPr>
+        <w:spacing w:line="360" w:lineRule="auto"/>
         <w:rPr>
           <w:b/>
           <w:sz w:val="28"/>
           <w:szCs w:val="28"/>
         </w:rPr>
-        <w:t>Tecnologias</w:t>
-      </w:r>
-    </w:p>
-    <w:p>
-      <w:pPr>
-        <w:ind w:right="113"/>
-        <w:jc w:val="both"/>
-        <w:rPr>
-          <w:sz w:val="24"/>
-          <w:szCs w:val="24"/>
-        </w:rPr>
-      </w:pPr>
-      <w:r>
-        <w:rPr>
-          <w:sz w:val="24"/>
-          <w:szCs w:val="24"/>
-        </w:rPr>
-        <w:t>React</w:t>
-      </w:r>
-      <w:r>
-        <w:rPr>
-          <w:sz w:val="24"/>
-          <w:szCs w:val="24"/>
-        </w:rPr>
-        <w:t>,</w:t>
-      </w:r>
-      <w:r>
-        <w:rPr>
-          <w:sz w:val="24"/>
-          <w:szCs w:val="24"/>
-        </w:rPr>
-        <w:t xml:space="preserve"> Next</w:t>
-      </w:r>
-      <w:r>
-        <w:rPr>
-          <w:sz w:val="24"/>
-          <w:szCs w:val="24"/>
-        </w:rPr>
-        <w:t>JS,</w:t>
-      </w:r>
-      <w:r>
-        <w:rPr>
-          <w:sz w:val="24"/>
-          <w:szCs w:val="24"/>
-        </w:rPr>
-        <w:t xml:space="preserve"> TypeScript</w:t>
-      </w:r>
-      <w:r>
-        <w:rPr>
-          <w:sz w:val="24"/>
-          <w:szCs w:val="24"/>
-        </w:rPr>
-        <w:t>,</w:t>
-      </w:r>
-      <w:r>
-        <w:rPr>
-          <w:sz w:val="24"/>
-          <w:szCs w:val="24"/>
-        </w:rPr>
-        <w:t xml:space="preserve"> JavaScript</w:t>
-      </w:r>
-      <w:r>
-        <w:rPr>
-          <w:sz w:val="24"/>
-          <w:szCs w:val="24"/>
-        </w:rPr>
-        <w:t>,</w:t>
-      </w:r>
-      <w:r>
-        <w:rPr>
-          <w:sz w:val="24"/>
-          <w:szCs w:val="24"/>
-        </w:rPr>
-        <w:t xml:space="preserve"> HTML</w:t>
-      </w:r>
-      <w:r>
-        <w:rPr>
-          <w:sz w:val="24"/>
-          <w:szCs w:val="24"/>
-        </w:rPr>
-        <w:t>5,</w:t>
-      </w:r>
-      <w:r>
-        <w:rPr>
-          <w:sz w:val="24"/>
-          <w:szCs w:val="24"/>
-        </w:rPr>
-        <w:t xml:space="preserve"> CSS</w:t>
-      </w:r>
-      <w:r>
-        <w:rPr>
-          <w:sz w:val="24"/>
-          <w:szCs w:val="24"/>
-        </w:rPr>
-        <w:t xml:space="preserve">3, Testes, Jest, Testing-library, Firebase, SEO, </w:t>
-      </w:r>
-      <w:r>
-        <w:rPr>
-          <w:sz w:val="24"/>
-          <w:szCs w:val="24"/>
-        </w:rPr>
-        <w:t>Sass</w:t>
-      </w:r>
-      <w:r>
-        <w:rPr>
-          <w:sz w:val="24"/>
-          <w:szCs w:val="24"/>
-        </w:rPr>
-        <w:t>,</w:t>
-      </w:r>
-      <w:r>
-        <w:rPr>
-          <w:sz w:val="24"/>
-          <w:szCs w:val="24"/>
-        </w:rPr>
-        <w:t xml:space="preserve"> GIT</w:t>
-      </w:r>
-      <w:r>
-        <w:rPr>
-          <w:sz w:val="24"/>
-          <w:szCs w:val="24"/>
-        </w:rPr>
-        <w:t>,</w:t>
-      </w:r>
-      <w:r>
-        <w:rPr>
-          <w:sz w:val="24"/>
-          <w:szCs w:val="24"/>
-        </w:rPr>
-        <w:t xml:space="preserve"> GitHub</w:t>
-      </w:r>
-      <w:r>
-        <w:rPr>
-          <w:sz w:val="24"/>
-          <w:szCs w:val="24"/>
-        </w:rPr>
-        <w:t>,</w:t>
-      </w:r>
-      <w:r>
-        <w:rPr>
-          <w:sz w:val="24"/>
-          <w:szCs w:val="24"/>
-        </w:rPr>
-        <w:t xml:space="preserve"> </w:t>
-      </w:r>
-      <w:r>
-        <w:rPr>
-          <w:sz w:val="24"/>
-          <w:szCs w:val="24"/>
-        </w:rPr>
-        <w:t>Node</w:t>
-      </w:r>
-      <w:r>
-        <w:rPr>
-          <w:sz w:val="24"/>
-          <w:szCs w:val="24"/>
-        </w:rPr>
-        <w:t>JS,</w:t>
-      </w:r>
-      <w:r>
-        <w:rPr>
-          <w:sz w:val="24"/>
-          <w:szCs w:val="24"/>
-        </w:rPr>
-        <w:t xml:space="preserve"> MongoDB</w:t>
-      </w:r>
-      <w:r>
-        <w:rPr>
-          <w:sz w:val="24"/>
-          <w:szCs w:val="24"/>
-        </w:rPr>
-        <w:t>,</w:t>
-      </w:r>
-      <w:r>
-        <w:rPr>
-          <w:sz w:val="24"/>
-          <w:szCs w:val="24"/>
-        </w:rPr>
-        <w:t xml:space="preserve"> Figma</w:t>
-      </w:r>
-      <w:r>
-        <w:rPr>
-          <w:sz w:val="24"/>
-          <w:szCs w:val="24"/>
-        </w:rPr>
-        <w:t>,</w:t>
-      </w:r>
-      <w:r>
-        <w:rPr>
-          <w:sz w:val="24"/>
-          <w:szCs w:val="24"/>
-        </w:rPr>
-        <w:t xml:space="preserve"> AdobeXD</w:t>
-      </w:r>
-      <w:r>
-        <w:rPr>
-          <w:sz w:val="24"/>
-          <w:szCs w:val="24"/>
-        </w:rPr>
-        <w:t>.</w:t>
-      </w:r>
-    </w:p>
-    <w:p>
-      <w:pPr>
-        <w:ind w:right="113"/>
-        <w:rPr>
-          <w:sz w:val="24"/>
-          <w:szCs w:val="24"/>
-        </w:rPr>
-      </w:pPr>
-    </w:p>
-    <w:p>
-      <w:pPr>
-        <w:spacing w:line="360" w:lineRule="auto"/>
+      </w:pPr>
+      <w:r>
         <w:rPr>
           <w:b/>
           <w:sz w:val="28"/>
           <w:szCs w:val="28"/>
         </w:rPr>
-      </w:pPr>
-      <w:r>
+        <w:t>Tecnologias</w:t>
+      </w:r>
+    </w:p>
+    <w:p>
+      <w:pPr>
+        <w:ind w:right="113"/>
+        <w:jc w:val="both"/>
+        <w:rPr>
+          <w:sz w:val="24"/>
+          <w:szCs w:val="24"/>
+        </w:rPr>
+      </w:pPr>
+      <w:r>
+        <w:rPr>
+          <w:sz w:val="24"/>
+          <w:szCs w:val="24"/>
+        </w:rPr>
+        <w:t xml:space="preserve">IA, </w:t>
+      </w:r>
+      <w:r>
+        <w:rPr>
+          <w:sz w:val="24"/>
+          <w:szCs w:val="24"/>
+        </w:rPr>
+        <w:t>React</w:t>
+      </w:r>
+      <w:r>
+        <w:rPr>
+          <w:sz w:val="24"/>
+          <w:szCs w:val="24"/>
+        </w:rPr>
+        <w:t>,</w:t>
+      </w:r>
+      <w:r>
+        <w:rPr>
+          <w:sz w:val="24"/>
+          <w:szCs w:val="24"/>
+        </w:rPr>
+        <w:t xml:space="preserve"> Next</w:t>
+      </w:r>
+      <w:r>
+        <w:rPr>
+          <w:sz w:val="24"/>
+          <w:szCs w:val="24"/>
+        </w:rPr>
+        <w:t>JS,</w:t>
+      </w:r>
+      <w:r>
+        <w:rPr>
+          <w:sz w:val="24"/>
+          <w:szCs w:val="24"/>
+        </w:rPr>
+        <w:t xml:space="preserve"> Vite,</w:t>
+      </w:r>
+      <w:r>
+        <w:rPr>
+          <w:sz w:val="24"/>
+          <w:szCs w:val="24"/>
+        </w:rPr>
+        <w:t xml:space="preserve"> TypeScript</w:t>
+      </w:r>
+      <w:r>
+        <w:rPr>
+          <w:sz w:val="24"/>
+          <w:szCs w:val="24"/>
+        </w:rPr>
+        <w:t>,</w:t>
+      </w:r>
+      <w:r>
+        <w:rPr>
+          <w:sz w:val="24"/>
+          <w:szCs w:val="24"/>
+        </w:rPr>
+        <w:t xml:space="preserve"> JavaScript</w:t>
+      </w:r>
+      <w:r>
+        <w:rPr>
+          <w:sz w:val="24"/>
+          <w:szCs w:val="24"/>
+        </w:rPr>
+        <w:t>,</w:t>
+      </w:r>
+      <w:r>
+        <w:rPr>
+          <w:sz w:val="24"/>
+          <w:szCs w:val="24"/>
+        </w:rPr>
+        <w:t xml:space="preserve"> Docker,</w:t>
+      </w:r>
+      <w:r>
+        <w:rPr>
+          <w:sz w:val="24"/>
+          <w:szCs w:val="24"/>
+        </w:rPr>
+        <w:t xml:space="preserve"> CI/CD</w:t>
+      </w:r>
+      <w:r>
+        <w:rPr>
+          <w:sz w:val="24"/>
+          <w:szCs w:val="24"/>
+        </w:rPr>
+        <w:t xml:space="preserve"> (Github Actions)</w:t>
+      </w:r>
+      <w:r>
+        <w:rPr>
+          <w:sz w:val="24"/>
+          <w:szCs w:val="24"/>
+        </w:rPr>
+        <w:t>,</w:t>
+      </w:r>
+      <w:r>
+        <w:rPr>
+          <w:sz w:val="24"/>
+          <w:szCs w:val="24"/>
+        </w:rPr>
+        <w:t xml:space="preserve"> HTML</w:t>
+      </w:r>
+      <w:r>
+        <w:rPr>
+          <w:sz w:val="24"/>
+          <w:szCs w:val="24"/>
+        </w:rPr>
+        <w:t>5,</w:t>
+      </w:r>
+      <w:r>
+        <w:rPr>
+          <w:sz w:val="24"/>
+          <w:szCs w:val="24"/>
+        </w:rPr>
+        <w:t xml:space="preserve"> CSS</w:t>
+      </w:r>
+      <w:r>
+        <w:rPr>
+          <w:sz w:val="24"/>
+          <w:szCs w:val="24"/>
+        </w:rPr>
+        <w:t>3</w:t>
+      </w:r>
+      <w:r>
+        <w:rPr>
+          <w:sz w:val="24"/>
+          <w:szCs w:val="24"/>
+        </w:rPr>
+        <w:t>, SASS</w:t>
+      </w:r>
+      <w:r>
+        <w:rPr>
+          <w:sz w:val="24"/>
+          <w:szCs w:val="24"/>
+        </w:rPr>
+        <w:t xml:space="preserve"> (Software as a Service)</w:t>
+      </w:r>
+      <w:r>
+        <w:rPr>
+          <w:sz w:val="24"/>
+          <w:szCs w:val="24"/>
+        </w:rPr>
+        <w:t xml:space="preserve">, Testes, Jest, </w:t>
+      </w:r>
+      <w:r>
+        <w:rPr>
+          <w:sz w:val="24"/>
+          <w:szCs w:val="24"/>
+        </w:rPr>
+        <w:t>React T</w:t>
+      </w:r>
+      <w:r>
+        <w:rPr>
+          <w:sz w:val="24"/>
+          <w:szCs w:val="24"/>
+        </w:rPr>
+        <w:t>esting</w:t>
+      </w:r>
+      <w:r>
+        <w:rPr>
+          <w:sz w:val="24"/>
+          <w:szCs w:val="24"/>
+        </w:rPr>
+        <w:t xml:space="preserve"> L</w:t>
+      </w:r>
+      <w:r>
+        <w:rPr>
+          <w:sz w:val="24"/>
+          <w:szCs w:val="24"/>
+        </w:rPr>
+        <w:t xml:space="preserve">ibrary, </w:t>
+      </w:r>
+      <w:r>
+        <w:rPr>
+          <w:sz w:val="24"/>
+          <w:szCs w:val="24"/>
+        </w:rPr>
+        <w:t xml:space="preserve">Zod, </w:t>
+      </w:r>
+      <w:r>
+        <w:rPr>
+          <w:sz w:val="24"/>
+          <w:szCs w:val="24"/>
+        </w:rPr>
+        <w:t xml:space="preserve">Firebase, SEO, </w:t>
+      </w:r>
+      <w:r>
+        <w:rPr>
+          <w:sz w:val="24"/>
+          <w:szCs w:val="24"/>
+        </w:rPr>
+        <w:t>Sass</w:t>
+      </w:r>
+      <w:r>
+        <w:rPr>
+          <w:sz w:val="24"/>
+          <w:szCs w:val="24"/>
+        </w:rPr>
+        <w:t>,</w:t>
+      </w:r>
+      <w:r>
+        <w:rPr>
+          <w:sz w:val="24"/>
+          <w:szCs w:val="24"/>
+        </w:rPr>
+        <w:t xml:space="preserve"> GIT</w:t>
+      </w:r>
+      <w:r>
+        <w:rPr>
+          <w:sz w:val="24"/>
+          <w:szCs w:val="24"/>
+        </w:rPr>
+        <w:t>,</w:t>
+      </w:r>
+      <w:r>
+        <w:rPr>
+          <w:sz w:val="24"/>
+          <w:szCs w:val="24"/>
+        </w:rPr>
+        <w:t xml:space="preserve"> GitHub</w:t>
+      </w:r>
+      <w:r>
+        <w:rPr>
+          <w:sz w:val="24"/>
+          <w:szCs w:val="24"/>
+        </w:rPr>
+        <w:t>,</w:t>
+      </w:r>
+      <w:r>
+        <w:rPr>
+          <w:sz w:val="24"/>
+          <w:szCs w:val="24"/>
+        </w:rPr>
+        <w:t xml:space="preserve"> </w:t>
+      </w:r>
+      <w:r>
+        <w:rPr>
+          <w:sz w:val="24"/>
+          <w:szCs w:val="24"/>
+        </w:rPr>
+        <w:t>Node</w:t>
+      </w:r>
+      <w:r>
+        <w:rPr>
+          <w:sz w:val="24"/>
+          <w:szCs w:val="24"/>
+        </w:rPr>
+        <w:t>JS,</w:t>
+      </w:r>
+      <w:r>
+        <w:rPr>
+          <w:sz w:val="24"/>
+          <w:szCs w:val="24"/>
+        </w:rPr>
+        <w:t xml:space="preserve"> MongoDB</w:t>
+      </w:r>
+      <w:r>
+        <w:rPr>
+          <w:sz w:val="24"/>
+          <w:szCs w:val="24"/>
+        </w:rPr>
+        <w:t>,</w:t>
+      </w:r>
+      <w:r>
+        <w:rPr>
+          <w:sz w:val="24"/>
+          <w:szCs w:val="24"/>
+        </w:rPr>
+        <w:t xml:space="preserve"> Figma</w:t>
+      </w:r>
+      <w:r>
+        <w:rPr>
+          <w:sz w:val="24"/>
+          <w:szCs w:val="24"/>
+        </w:rPr>
+        <w:t>,</w:t>
+      </w:r>
+      <w:r>
+        <w:rPr>
+          <w:sz w:val="24"/>
+          <w:szCs w:val="24"/>
+        </w:rPr>
+        <w:t xml:space="preserve"> AdobeXD</w:t>
+      </w:r>
+      <w:r>
+        <w:rPr>
+          <w:sz w:val="24"/>
+          <w:szCs w:val="24"/>
+        </w:rPr>
+        <w:t>.</w:t>
+      </w:r>
+    </w:p>
+    <w:p>
+      <w:pPr>
+        <w:ind w:right="113"/>
+        <w:rPr>
+          <w:sz w:val="24"/>
+          <w:szCs w:val="24"/>
+        </w:rPr>
+      </w:pPr>
+    </w:p>
+    <w:p>
+      <w:pPr>
+        <w:spacing w:line="360" w:lineRule="auto"/>
         <w:rPr>
           <w:b/>
           <w:sz w:val="28"/>
           <w:szCs w:val="28"/>
         </w:rPr>
-        <w:t>Experiência acadêmica</w:t>
-      </w:r>
-    </w:p>
-    <w:p>
-      <w:pPr>
-        <w:ind w:right="113"/>
-        <w:jc w:val="both"/>
-        <w:rPr>
-          <w:sz w:val="24"/>
-          <w:szCs w:val="24"/>
-        </w:rPr>
-      </w:pPr>
-      <w:r>
-        <w:rPr>
-          <w:sz w:val="24"/>
-          <w:szCs w:val="24"/>
-        </w:rPr>
-        <w:t>Análise e desenvolvimento de sistemas | 20</w:t>
-      </w:r>
-      <w:r>
-        <w:rPr>
-          <w:sz w:val="24"/>
-          <w:szCs w:val="24"/>
-        </w:rPr>
-        <w:t>21</w:t>
-      </w:r>
-      <w:r>
-        <w:rPr>
-          <w:sz w:val="24"/>
-          <w:szCs w:val="24"/>
-        </w:rPr>
-        <w:t xml:space="preserve"> - 20</w:t>
-      </w:r>
-      <w:r>
-        <w:rPr>
-          <w:sz w:val="24"/>
-          <w:szCs w:val="24"/>
-        </w:rPr>
-        <w:t>23</w:t>
-      </w:r>
-    </w:p>
-    <w:p>
-      <w:pPr>
-        <w:ind w:right="113"/>
-        <w:jc w:val="both"/>
-        <w:rPr>
-          <w:sz w:val="24"/>
-          <w:szCs w:val="24"/>
-        </w:rPr>
-      </w:pPr>
-      <w:r>
-        <w:rPr>
-          <w:sz w:val="24"/>
-          <w:szCs w:val="24"/>
-        </w:rPr>
-        <w:t>FMU – São Paulo, SP</w:t>
-      </w:r>
-    </w:p>
-    <w:p>
-      <w:pPr>
-        <w:ind w:right="113"/>
-        <w:jc w:val="both"/>
-        <w:rPr>
-          <w:sz w:val="24"/>
-          <w:szCs w:val="24"/>
-        </w:rPr>
-      </w:pPr>
-    </w:p>
-    <w:p>
-      <w:pPr>
-        <w:spacing w:line="360" w:lineRule="auto"/>
+      </w:pPr>
+      <w:r>
         <w:rPr>
           <w:b/>
           <w:sz w:val="28"/>
           <w:szCs w:val="28"/>
         </w:rPr>
-      </w:pPr>
-      <w:r>
+        <w:t>Experiência acadêmica</w:t>
+      </w:r>
+    </w:p>
+    <w:p>
+      <w:pPr>
+        <w:ind w:right="113"/>
+        <w:jc w:val="both"/>
+        <w:rPr>
+          <w:sz w:val="24"/>
+          <w:szCs w:val="24"/>
+        </w:rPr>
+      </w:pPr>
+      <w:r>
+        <w:rPr>
+          <w:sz w:val="24"/>
+          <w:szCs w:val="24"/>
+        </w:rPr>
+        <w:t>Análise e desenvolvimento de sistemas | 20</w:t>
+      </w:r>
+      <w:r>
+        <w:rPr>
+          <w:sz w:val="24"/>
+          <w:szCs w:val="24"/>
+        </w:rPr>
+        <w:t>21</w:t>
+      </w:r>
+      <w:r>
+        <w:rPr>
+          <w:sz w:val="24"/>
+          <w:szCs w:val="24"/>
+        </w:rPr>
+        <w:t xml:space="preserve"> - 20</w:t>
+      </w:r>
+      <w:r>
+        <w:rPr>
+          <w:sz w:val="24"/>
+          <w:szCs w:val="24"/>
+        </w:rPr>
+        <w:t>23</w:t>
+      </w:r>
+    </w:p>
+    <w:p>
+      <w:pPr>
+        <w:ind w:right="113"/>
+        <w:jc w:val="both"/>
+        <w:rPr>
+          <w:sz w:val="24"/>
+          <w:szCs w:val="24"/>
+        </w:rPr>
+      </w:pPr>
+      <w:r>
+        <w:rPr>
+          <w:sz w:val="24"/>
+          <w:szCs w:val="24"/>
+        </w:rPr>
+        <w:t>FMU – São Paulo, SP</w:t>
+      </w:r>
+    </w:p>
+    <w:p>
+      <w:pPr>
+        <w:ind w:right="113"/>
+        <w:jc w:val="both"/>
+        <w:rPr>
+          <w:sz w:val="24"/>
+          <w:szCs w:val="24"/>
+        </w:rPr>
+      </w:pPr>
+    </w:p>
+    <w:p>
+      <w:pPr>
+        <w:spacing w:line="360" w:lineRule="auto"/>
         <w:rPr>
           <w:b/>
           <w:sz w:val="28"/>
           <w:szCs w:val="28"/>
         </w:rPr>
+      </w:pPr>
+      <w:r>
+        <w:rPr>
+          <w:b/>
+          <w:sz w:val="28"/>
+          <w:szCs w:val="28"/>
+        </w:rPr>
         <w:t>Certificados</w:t>
       </w:r>
     </w:p>
@@ -765,7 +1429,7 @@
           <w:szCs w:val="24"/>
         </w:rPr>
       </w:pPr>
-      <w:hyperlink r:id="rId9" w:history="1">
+      <w:hyperlink r:id="rId14" w:history="1">
         <w:r>
           <w:rPr>
             <w:rStyle w:val="Hyperlink"/>
@@ -789,7 +1453,7 @@
         </w:rPr>
         <w:t xml:space="preserve"> </w:t>
       </w:r>
-      <w:hyperlink r:id="rId10" w:history="1">
+      <w:hyperlink r:id="rId15" w:history="1">
         <w:r>
           <w:rPr>
             <w:rStyle w:val="Hyperlink"/>
@@ -813,7 +1477,7 @@
         </w:rPr>
         <w:t xml:space="preserve"> </w:t>
       </w:r>
-      <w:hyperlink r:id="rId11" w:history="1">
+      <w:hyperlink r:id="rId16" w:history="1">
         <w:r>
           <w:rPr>
             <w:rStyle w:val="Hyperlink"/>
@@ -830,7 +1494,7 @@
         </w:rPr>
         <w:t xml:space="preserve">, </w:t>
       </w:r>
-      <w:hyperlink r:id="rId12" w:history="1">
+      <w:hyperlink r:id="rId17" w:history="1">
         <w:r>
           <w:rPr>
             <w:rStyle w:val="Hyperlink"/>
@@ -847,7 +1511,7 @@
         </w:rPr>
         <w:t xml:space="preserve">, </w:t>
       </w:r>
-      <w:hyperlink r:id="rId13" w:history="1">
+      <w:hyperlink r:id="rId18" w:history="1">
         <w:r>
           <w:rPr>
             <w:rStyle w:val="Hyperlink"/>
@@ -864,7 +1528,7 @@
         </w:rPr>
         <w:t xml:space="preserve">, </w:t>
       </w:r>
-      <w:hyperlink r:id="rId14" w:history="1">
+      <w:hyperlink r:id="rId19" w:history="1">
         <w:r>
           <w:rPr>
             <w:rStyle w:val="Hyperlink"/>
@@ -933,6 +1597,315 @@
     </w:p>
   </w:footnote>
 </w:footnotes>
+</file>
+
+<file path=word/numbering.xml><?xml version="1.0" encoding="utf-8"?>
+<w:numbering xmlns:wpc="http://schemas.microsoft.com/office/word/2010/wordprocessingCanvas" xmlns:cx="http://schemas.microsoft.com/office/drawing/2014/chartex" xmlns:cx1="http://schemas.microsoft.com/office/drawing/2015/9/8/chartex" xmlns:cx2="http://schemas.microsoft.com/office/drawing/2015/10/21/chartex" xmlns:cx3="http://schemas.microsoft.com/office/drawing/2016/5/9/chartex" xmlns:cx4="http://schemas.microsoft.com/office/drawing/2016/5/10/chartex" xmlns:cx5="http://schemas.microsoft.com/office/drawing/2016/5/11/chartex" xmlns:cx6="http://schemas.microsoft.com/office/drawing/2016/5/12/chartex" xmlns:cx7="http://schemas.microsoft.com/office/drawing/2016/5/13/chartex" xmlns:cx8="http://schemas.microsoft.com/office/drawing/2016/5/14/chartex" xmlns:mc="http://schemas.openxmlformats.org/markup-compatibility/2006" xmlns:aink="http://schemas.microsoft.com/office/drawing/2016/ink" xmlns:am3d="http://schemas.microsoft.com/office/drawing/2017/model3d" xmlns:o="urn:schemas-microsoft-com:office:office" xmlns:oel="http://schemas.microsoft.com/office/2019/extlst" xmlns:r="http://schemas.openxmlformats.org/officeDocument/2006/relationships" xmlns:m="http://schemas.openxmlformats.org/officeDocument/2006/math" xmlns:v="urn:schemas-microsoft-com:vml" xmlns:wp14="http://schemas.microsoft.com/office/word/2010/wordprocessingDrawing" xmlns:wp="http://schemas.openxmlformats.org/drawingml/2006/wordprocessingDrawing" xmlns:w10="urn:schemas-microsoft-com:office:word" xmlns:w="http://schemas.openxmlformats.org/wordprocessingml/2006/main" xmlns:w14="http://schemas.microsoft.com/office/word/2010/wordml" xmlns:w15="http://schemas.microsoft.com/office/word/2012/wordml" xmlns:w16cex="http://schemas.microsoft.com/office/word/2018/wordml/cex" xmlns:w16cid="http://schemas.microsoft.com/office/word/2016/wordml/cid" xmlns:w16="http://schemas.microsoft.com/office/word/2018/wordml" xmlns:w16du="http://schemas.microsoft.com/office/word/2023/wordml/word16du" xmlns:w16sdtdh="http://schemas.microsoft.com/office/word/2020/wordml/sdtdatahash" xmlns:w16sdtfl="http://schemas.microsoft.com/office/word/2024/wordml/sdtformatlock" xmlns:w16se="http://schemas.microsoft.com/office/word/2015/wordml/symex" xmlns:wpg="http://schemas.microsoft.com/office/word/2010/wordprocessingGroup" xmlns:wpi="http://schemas.microsoft.com/office/word/2010/wordprocessingInk" xmlns:wne="http://schemas.microsoft.com/office/word/2006/wordml" xmlns:wps="http://schemas.microsoft.com/office/word/2010/wordprocessingShape" mc:Ignorable="w14 w15 w16se w16cid w16 w16cex w16sdtdh w16sdtfl w16du wp14">
+  <w:abstractNum w:abstractNumId="0" w15:restartNumberingAfterBreak="0">
+    <w:nsid w:val="1FD576DD"/>
+    <w:multiLevelType w:val="multilevel"/>
+    <w:tmpl w:val="901601A6"/>
+    <w:lvl w:ilvl="0">
+      <w:start w:val="1"/>
+      <w:numFmt w:val="bullet"/>
+      <w:lvlText w:val=""/>
+      <w:lvlJc w:val="left"/>
+      <w:pPr>
+        <w:tabs>
+          <w:tab w:val="num" w:pos="720"/>
+        </w:tabs>
+        <w:ind w:left="720" w:hanging="360"/>
+      </w:pPr>
+      <w:rPr>
+        <w:rFonts w:ascii="Symbol" w:hAnsi="Symbol" w:hint="default"/>
+        <w:sz w:val="20"/>
+      </w:rPr>
+    </w:lvl>
+    <w:lvl w:ilvl="1" w:tentative="1">
+      <w:start w:val="1"/>
+      <w:numFmt w:val="bullet"/>
+      <w:lvlText w:val="o"/>
+      <w:lvlJc w:val="left"/>
+      <w:pPr>
+        <w:tabs>
+          <w:tab w:val="num" w:pos="1440"/>
+        </w:tabs>
+        <w:ind w:left="1440" w:hanging="360"/>
+      </w:pPr>
+      <w:rPr>
+        <w:rFonts w:ascii="Courier New" w:hAnsi="Courier New" w:hint="default"/>
+        <w:sz w:val="20"/>
+      </w:rPr>
+    </w:lvl>
+    <w:lvl w:ilvl="2" w:tentative="1">
+      <w:start w:val="1"/>
+      <w:numFmt w:val="bullet"/>
+      <w:lvlText w:val=""/>
+      <w:lvlJc w:val="left"/>
+      <w:pPr>
+        <w:tabs>
+          <w:tab w:val="num" w:pos="2160"/>
+        </w:tabs>
+        <w:ind w:left="2160" w:hanging="360"/>
+      </w:pPr>
+      <w:rPr>
+        <w:rFonts w:ascii="Wingdings" w:hAnsi="Wingdings" w:hint="default"/>
+        <w:sz w:val="20"/>
+      </w:rPr>
+    </w:lvl>
+    <w:lvl w:ilvl="3" w:tentative="1">
+      <w:start w:val="1"/>
+      <w:numFmt w:val="bullet"/>
+      <w:lvlText w:val=""/>
+      <w:lvlJc w:val="left"/>
+      <w:pPr>
+        <w:tabs>
+          <w:tab w:val="num" w:pos="2880"/>
+        </w:tabs>
+        <w:ind w:left="2880" w:hanging="360"/>
+      </w:pPr>
+      <w:rPr>
+        <w:rFonts w:ascii="Wingdings" w:hAnsi="Wingdings" w:hint="default"/>
+        <w:sz w:val="20"/>
+      </w:rPr>
+    </w:lvl>
+    <w:lvl w:ilvl="4" w:tentative="1">
+      <w:start w:val="1"/>
+      <w:numFmt w:val="bullet"/>
+      <w:lvlText w:val=""/>
+      <w:lvlJc w:val="left"/>
+      <w:pPr>
+        <w:tabs>
+          <w:tab w:val="num" w:pos="3600"/>
+        </w:tabs>
+        <w:ind w:left="3600" w:hanging="360"/>
+      </w:pPr>
+      <w:rPr>
+        <w:rFonts w:ascii="Wingdings" w:hAnsi="Wingdings" w:hint="default"/>
+        <w:sz w:val="20"/>
+      </w:rPr>
+    </w:lvl>
+    <w:lvl w:ilvl="5" w:tentative="1">
+      <w:start w:val="1"/>
+      <w:numFmt w:val="bullet"/>
+      <w:lvlText w:val=""/>
+      <w:lvlJc w:val="left"/>
+      <w:pPr>
+        <w:tabs>
+          <w:tab w:val="num" w:pos="4320"/>
+        </w:tabs>
+        <w:ind w:left="4320" w:hanging="360"/>
+      </w:pPr>
+      <w:rPr>
+        <w:rFonts w:ascii="Wingdings" w:hAnsi="Wingdings" w:hint="default"/>
+        <w:sz w:val="20"/>
+      </w:rPr>
+    </w:lvl>
+    <w:lvl w:ilvl="6" w:tentative="1">
+      <w:start w:val="1"/>
+      <w:numFmt w:val="bullet"/>
+      <w:lvlText w:val=""/>
+      <w:lvlJc w:val="left"/>
+      <w:pPr>
+        <w:tabs>
+          <w:tab w:val="num" w:pos="5040"/>
+        </w:tabs>
+        <w:ind w:left="5040" w:hanging="360"/>
+      </w:pPr>
+      <w:rPr>
+        <w:rFonts w:ascii="Wingdings" w:hAnsi="Wingdings" w:hint="default"/>
+        <w:sz w:val="20"/>
+      </w:rPr>
+    </w:lvl>
+    <w:lvl w:ilvl="7" w:tentative="1">
+      <w:start w:val="1"/>
+      <w:numFmt w:val="bullet"/>
+      <w:lvlText w:val=""/>
+      <w:lvlJc w:val="left"/>
+      <w:pPr>
+        <w:tabs>
+          <w:tab w:val="num" w:pos="5760"/>
+        </w:tabs>
+        <w:ind w:left="5760" w:hanging="360"/>
+      </w:pPr>
+      <w:rPr>
+        <w:rFonts w:ascii="Wingdings" w:hAnsi="Wingdings" w:hint="default"/>
+        <w:sz w:val="20"/>
+      </w:rPr>
+    </w:lvl>
+    <w:lvl w:ilvl="8" w:tentative="1">
+      <w:start w:val="1"/>
+      <w:numFmt w:val="bullet"/>
+      <w:lvlText w:val=""/>
+      <w:lvlJc w:val="left"/>
+      <w:pPr>
+        <w:tabs>
+          <w:tab w:val="num" w:pos="6480"/>
+        </w:tabs>
+        <w:ind w:left="6480" w:hanging="360"/>
+      </w:pPr>
+      <w:rPr>
+        <w:rFonts w:ascii="Wingdings" w:hAnsi="Wingdings" w:hint="default"/>
+        <w:sz w:val="20"/>
+      </w:rPr>
+    </w:lvl>
+  </w:abstractNum>
+  <w:abstractNum w:abstractNumId="1" w15:restartNumberingAfterBreak="0">
+    <w:nsid w:val="71AD4E08"/>
+    <w:multiLevelType w:val="multilevel"/>
+    <w:tmpl w:val="82AC64C8"/>
+    <w:lvl w:ilvl="0">
+      <w:start w:val="1"/>
+      <w:numFmt w:val="bullet"/>
+      <w:lvlText w:val=""/>
+      <w:lvlJc w:val="left"/>
+      <w:pPr>
+        <w:tabs>
+          <w:tab w:val="num" w:pos="720"/>
+        </w:tabs>
+        <w:ind w:left="720" w:hanging="360"/>
+      </w:pPr>
+      <w:rPr>
+        <w:rFonts w:ascii="Symbol" w:hAnsi="Symbol" w:hint="default"/>
+        <w:sz w:val="20"/>
+      </w:rPr>
+    </w:lvl>
+    <w:lvl w:ilvl="1" w:tentative="1">
+      <w:start w:val="1"/>
+      <w:numFmt w:val="bullet"/>
+      <w:lvlText w:val="o"/>
+      <w:lvlJc w:val="left"/>
+      <w:pPr>
+        <w:tabs>
+          <w:tab w:val="num" w:pos="1440"/>
+        </w:tabs>
+        <w:ind w:left="1440" w:hanging="360"/>
+      </w:pPr>
+      <w:rPr>
+        <w:rFonts w:ascii="Courier New" w:hAnsi="Courier New" w:hint="default"/>
+        <w:sz w:val="20"/>
+      </w:rPr>
+    </w:lvl>
+    <w:lvl w:ilvl="2" w:tentative="1">
+      <w:start w:val="1"/>
+      <w:numFmt w:val="bullet"/>
+      <w:lvlText w:val=""/>
+      <w:lvlJc w:val="left"/>
+      <w:pPr>
+        <w:tabs>
+          <w:tab w:val="num" w:pos="2160"/>
+        </w:tabs>
+        <w:ind w:left="2160" w:hanging="360"/>
+      </w:pPr>
+      <w:rPr>
+        <w:rFonts w:ascii="Wingdings" w:hAnsi="Wingdings" w:hint="default"/>
+        <w:sz w:val="20"/>
+      </w:rPr>
+    </w:lvl>
+    <w:lvl w:ilvl="3" w:tentative="1">
+      <w:start w:val="1"/>
+      <w:numFmt w:val="bullet"/>
+      <w:lvlText w:val=""/>
+      <w:lvlJc w:val="left"/>
+      <w:pPr>
+        <w:tabs>
+          <w:tab w:val="num" w:pos="2880"/>
+        </w:tabs>
+        <w:ind w:left="2880" w:hanging="360"/>
+      </w:pPr>
+      <w:rPr>
+        <w:rFonts w:ascii="Wingdings" w:hAnsi="Wingdings" w:hint="default"/>
+        <w:sz w:val="20"/>
+      </w:rPr>
+    </w:lvl>
+    <w:lvl w:ilvl="4" w:tentative="1">
+      <w:start w:val="1"/>
+      <w:numFmt w:val="bullet"/>
+      <w:lvlText w:val=""/>
+      <w:lvlJc w:val="left"/>
+      <w:pPr>
+        <w:tabs>
+          <w:tab w:val="num" w:pos="3600"/>
+        </w:tabs>
+        <w:ind w:left="3600" w:hanging="360"/>
+      </w:pPr>
+      <w:rPr>
+        <w:rFonts w:ascii="Wingdings" w:hAnsi="Wingdings" w:hint="default"/>
+        <w:sz w:val="20"/>
+      </w:rPr>
+    </w:lvl>
+    <w:lvl w:ilvl="5" w:tentative="1">
+      <w:start w:val="1"/>
+      <w:numFmt w:val="bullet"/>
+      <w:lvlText w:val=""/>
+      <w:lvlJc w:val="left"/>
+      <w:pPr>
+        <w:tabs>
+          <w:tab w:val="num" w:pos="4320"/>
+        </w:tabs>
+        <w:ind w:left="4320" w:hanging="360"/>
+      </w:pPr>
+      <w:rPr>
+        <w:rFonts w:ascii="Wingdings" w:hAnsi="Wingdings" w:hint="default"/>
+        <w:sz w:val="20"/>
+      </w:rPr>
+    </w:lvl>
+    <w:lvl w:ilvl="6" w:tentative="1">
+      <w:start w:val="1"/>
+      <w:numFmt w:val="bullet"/>
+      <w:lvlText w:val=""/>
+      <w:lvlJc w:val="left"/>
+      <w:pPr>
+        <w:tabs>
+          <w:tab w:val="num" w:pos="5040"/>
+        </w:tabs>
+        <w:ind w:left="5040" w:hanging="360"/>
+      </w:pPr>
+      <w:rPr>
+        <w:rFonts w:ascii="Wingdings" w:hAnsi="Wingdings" w:hint="default"/>
+        <w:sz w:val="20"/>
+      </w:rPr>
+    </w:lvl>
+    <w:lvl w:ilvl="7" w:tentative="1">
+      <w:start w:val="1"/>
+      <w:numFmt w:val="bullet"/>
+      <w:lvlText w:val=""/>
+      <w:lvlJc w:val="left"/>
+      <w:pPr>
+        <w:tabs>
+          <w:tab w:val="num" w:pos="5760"/>
+        </w:tabs>
+        <w:ind w:left="5760" w:hanging="360"/>
+      </w:pPr>
+      <w:rPr>
+        <w:rFonts w:ascii="Wingdings" w:hAnsi="Wingdings" w:hint="default"/>
+        <w:sz w:val="20"/>
+      </w:rPr>
+    </w:lvl>
+    <w:lvl w:ilvl="8" w:tentative="1">
+      <w:start w:val="1"/>
+      <w:numFmt w:val="bullet"/>
+      <w:lvlText w:val=""/>
+      <w:lvlJc w:val="left"/>
+      <w:pPr>
+        <w:tabs>
+          <w:tab w:val="num" w:pos="6480"/>
+        </w:tabs>
+        <w:ind w:left="6480" w:hanging="360"/>
+      </w:pPr>
+      <w:rPr>
+        <w:rFonts w:ascii="Wingdings" w:hAnsi="Wingdings" w:hint="default"/>
+        <w:sz w:val="20"/>
+      </w:rPr>
+    </w:lvl>
+  </w:abstractNum>
+  <w:num w:numId="1" w16cid:durableId="1598826073">
+    <w:abstractNumId w:val="1"/>
+  </w:num>
+  <w:num w:numId="2" w16cid:durableId="1600328214">
+    <w:abstractNumId w:val="0"/>
+  </w:num>
+</w:numbering>
 </file>
 
 <file path=word/styles.xml><?xml version="1.0" encoding="utf-8"?>
@@ -1450,7 +2423,6 @@
   <w:style w:type="character" w:default="1" w:styleId="Fontepargpadro">
     <w:name w:val="Default Paragraph Font"/>
     <w:uiPriority w:val="1"/>
-    <w:semiHidden/>
     <w:unhideWhenUsed/>
   </w:style>
   <w:style w:type="table" w:default="1" w:styleId="Tabelanormal">

</xml_diff>